<commit_message>
Clarify upgrade scope around existing SaleMaX panels and modules
</commit_message>
<xml_diff>
--- a/docs/SALEMAX_TRAINING_CENTER_IMPLEMENTATION_PLAN.docx
+++ b/docs/SALEMAX_TRAINING_CENTER_IMPLEMENTATION_PLAN.docx
@@ -12,7 +12,7 @@
     </w:p>
     <w:p>
       <w:r>
-        <w:t>Version 1.1 | Audited 1 October 2026 | Product owner and implementation team</w:t>
+        <w:t>Version 1.2 | Existing-project scope confirmed 1 October 2026 | Product owner and implementation team</w:t>
       </w:r>
     </w:p>
     <w:p>
@@ -25,27 +25,12 @@
     </w:p>
     <w:p>
       <w:r>
-        <w:rPr>
-          <w:b/>
-        </w:rPr>
-        <w:t>Build SaleMaX into a category-based business SaaS, launching with a complete training-center sales and collections workspace.</w:t>
-      </w:r>
-      <w:r>
-        <w:t xml:space="preserve"> Keep the existing messaging and agent experience, strengthen the shared platform, and connect every enquiry to an accountable agent, a course, an enrollment, an invoice, an installment schedule, and verified receipts.</w:t>
+        <w:t>Upgrade the existing SaleMaX application into a category-based business SaaS, launching with a complete training-center sales and collections workspace. Reuse its working modules, admin and user panels, messaging and agent experience. Add the missing requirements to this project and connect every enquiry to an accountable agent, a course, an enrollment, an invoice, an installment schedule, and verified receipts.</w:t>
       </w:r>
     </w:p>
     <w:p>
       <w:r>
-        <w:t xml:space="preserve">The customer promise is simple: </w:t>
-      </w:r>
-      <w:r>
-        <w:rPr>
-          <w:b/>
-        </w:rPr>
-        <w:t>Know who is handling every lead, what needs to happen next, and what money is still due.</w:t>
-      </w:r>
-      <w:r>
-        <w:t xml:space="preserve"> The main user should run their center from one dashboard; an agent should start the day with a clear work queue; an accountant should reconcile collections without chasing spreadsheets. SaleMaX staff should onboard and support businesses from a separate management workspace, while only the platform owner enters Super Admin.</w:t>
+        <w:t>The customer promise is simple: Know who is handling every lead, what needs to happen next, and what money is still due. The main user should run their center from the existing business panel; an agent should start the day with a clear work queue; an accountant should reconcile collections without chasing spreadsheets. Upgrade the existing admin panel for owner and delegated staff operations, with Super Admin authority available only to the platform owner.</w:t>
       </w:r>
     </w:p>
     <w:p>
@@ -69,7 +54,680 @@
         <w:pStyle w:val="Heading2"/>
       </w:pPr>
       <w:r>
-        <w:t>What we will deliver</w:t>
+        <w:t>Mandatory existing-project implementation scope</w:t>
+      </w:r>
+    </w:p>
+    <w:p>
+      <w:pPr/>
+      <w:r>
+        <w:t>The owner confirmed that this is an upgrade of the supplied SaleMaX project. No new project, replacement application, recreated shell, separate CRM, duplicate plan catalogue, or parallel login is authorized. Preserve the existing backend, admin panel, user panel, working modules, navigation, branding and English/Arabic behavior. Improve existing screens in place; add screens only for requirements the application does not already provide, inside the appropriate existing panel.</w:t>
+      </w:r>
+    </w:p>
+    <w:p>
+      <w:pPr/>
+      <w:r>
+        <w:t>Preserve the /admin and /admin/login entry points for platform administration, and /user and /user/login for business users. Business login must not offer an administration switch. Owner and staff permissions change what the existing admin panel permits; they do not require another application shell. Existing agent entry points remain compatible with the shared identity upgrade.</w:t>
+      </w:r>
+    </w:p>
+    <w:p>
+      <w:pPr/>
+      <w:r>
+        <w:t>Start the plan work in the existing Manage Plans screen at /admin?page=manage-plans. Upgrade its current list, create/edit actions and assignment flow with categories, features, versioned contracts and role limits. Preserve existing commercial fields, plan IDs and assigned-user history through an explicit mapping. Do not implement a second catalogue at /admin/plans or make customers maintain two plan modules. Upgrade Manage Users and its current plan assignment at /admin?page=manage-users for category assignment and per-business limits.</w:t>
+      </w:r>
+    </w:p>
+    <w:tbl>
+      <w:tblPr>
+        <w:tblStyle w:val="TableGrid"/>
+        <w:tblW w:type="auto" w:w="0"/>
+        <w:tblLayout w:type="fixed"/>
+        <w:tblLook w:firstColumn="1" w:firstRow="1" w:lastColumn="0" w:lastRow="0" w:noHBand="0" w:noVBand="1" w:val="04A0"/>
+      </w:tblPr>
+      <w:tblGrid>
+        <w:gridCol w:w="3298"/>
+        <w:gridCol w:w="3298"/>
+        <w:gridCol w:w="3298"/>
+      </w:tblGrid>
+      <w:tr>
+        <w:trPr>
+          <w:tblHeader/>
+        </w:trPr>
+        <w:tc>
+          <w:tcPr>
+            <w:tcW w:type="dxa" w:w="1872"/>
+            <w:shd w:fill="E7E6E6"/>
+          </w:tcPr>
+          <w:p>
+            <w:pPr>
+              <w:spacing w:after="100" w:before="100"/>
+            </w:pPr>
+            <w:r>
+              <w:rPr>
+                <w:b/>
+                <w:color w:val="000000"/>
+                <w:sz w:val="18"/>
+              </w:rPr>
+              <w:t>Requirement</w:t>
+            </w:r>
+          </w:p>
+        </w:tc>
+        <w:tc>
+          <w:tcPr>
+            <w:tcW w:type="dxa" w:w="2880"/>
+            <w:shd w:fill="E7E6E6"/>
+          </w:tcPr>
+          <w:p>
+            <w:pPr>
+              <w:spacing w:after="100" w:before="100"/>
+            </w:pPr>
+            <w:r>
+              <w:rPr>
+                <w:b/>
+                <w:color w:val="000000"/>
+                <w:sz w:val="18"/>
+              </w:rPr>
+              <w:t>Existing module to extend</w:t>
+            </w:r>
+          </w:p>
+        </w:tc>
+        <w:tc>
+          <w:tcPr>
+            <w:tcW w:type="dxa" w:w="4320"/>
+            <w:shd w:fill="E7E6E6"/>
+          </w:tcPr>
+          <w:p>
+            <w:pPr>
+              <w:spacing w:after="100" w:before="100"/>
+            </w:pPr>
+            <w:r>
+              <w:rPr>
+                <w:b/>
+                <w:color w:val="000000"/>
+                <w:sz w:val="18"/>
+              </w:rPr>
+              <w:t>Missing work to add there</w:t>
+            </w:r>
+          </w:p>
+        </w:tc>
+      </w:tr>
+      <w:tr>
+        <w:tc>
+          <w:tcPr>
+            <w:tcW w:type="dxa" w:w="1872"/>
+          </w:tcPr>
+          <w:p>
+            <w:pPr>
+              <w:spacing w:after="100" w:before="100"/>
+            </w:pPr>
+            <w:r>
+              <w:rPr>
+                <w:b w:val="0"/>
+                <w:color w:val="000000"/>
+                <w:sz w:val="18"/>
+              </w:rPr>
+              <w:t>Super Admin and delegated staff</w:t>
+            </w:r>
+          </w:p>
+        </w:tc>
+        <w:tc>
+          <w:tcPr>
+            <w:tcW w:type="dxa" w:w="2880"/>
+          </w:tcPr>
+          <w:p>
+            <w:pPr>
+              <w:spacing w:after="100" w:before="100"/>
+            </w:pPr>
+            <w:r>
+              <w:rPr>
+                <w:b w:val="0"/>
+                <w:color w:val="000000"/>
+                <w:sz w:val="18"/>
+              </w:rPr>
+              <w:t>Existing /admin panel and administration routes</w:t>
+            </w:r>
+          </w:p>
+        </w:tc>
+        <w:tc>
+          <w:tcPr>
+            <w:tcW w:type="dxa" w:w="4320"/>
+          </w:tcPr>
+          <w:p>
+            <w:pPr>
+              <w:spacing w:after="100" w:before="100"/>
+            </w:pPr>
+            <w:r>
+              <w:rPr>
+                <w:b w:val="0"/>
+                <w:color w:val="000000"/>
+                <w:sz w:val="18"/>
+              </w:rPr>
+              <w:t>Owner-only authority, staff grants, audit, system health and bounded support access</w:t>
+            </w:r>
+          </w:p>
+        </w:tc>
+      </w:tr>
+      <w:tr>
+        <w:tc>
+          <w:tcPr>
+            <w:tcW w:type="dxa" w:w="1872"/>
+          </w:tcPr>
+          <w:p>
+            <w:pPr>
+              <w:spacing w:after="100" w:before="100"/>
+            </w:pPr>
+            <w:r>
+              <w:rPr>
+                <w:b w:val="0"/>
+                <w:color w:val="000000"/>
+                <w:sz w:val="18"/>
+              </w:rPr>
+              <w:t>Plans and role-seat limits</w:t>
+            </w:r>
+          </w:p>
+        </w:tc>
+        <w:tc>
+          <w:tcPr>
+            <w:tcW w:type="dxa" w:w="2880"/>
+          </w:tcPr>
+          <w:p>
+            <w:pPr>
+              <w:spacing w:after="100" w:before="100"/>
+            </w:pPr>
+            <w:r>
+              <w:rPr>
+                <w:b w:val="0"/>
+                <w:color w:val="000000"/>
+                <w:sz w:val="18"/>
+              </w:rPr>
+              <w:t>Existing Manage Plans and plan create/edit APIs</w:t>
+            </w:r>
+          </w:p>
+        </w:tc>
+        <w:tc>
+          <w:tcPr>
+            <w:tcW w:type="dxa" w:w="4320"/>
+          </w:tcPr>
+          <w:p>
+            <w:pPr>
+              <w:spacing w:after="100" w:before="100"/>
+            </w:pPr>
+            <w:r>
+              <w:rPr>
+                <w:b w:val="0"/>
+                <w:color w:val="000000"/>
+                <w:sz w:val="18"/>
+              </w:rPr>
+              <w:t>Category/features, account limits, draft/version/publication rules, impact review and preserved assignments</w:t>
+            </w:r>
+          </w:p>
+        </w:tc>
+      </w:tr>
+      <w:tr>
+        <w:tc>
+          <w:tcPr>
+            <w:tcW w:type="dxa" w:w="1872"/>
+          </w:tcPr>
+          <w:p>
+            <w:pPr>
+              <w:spacing w:after="100" w:before="100"/>
+            </w:pPr>
+            <w:r>
+              <w:rPr>
+                <w:b w:val="0"/>
+                <w:color w:val="000000"/>
+                <w:sz w:val="18"/>
+              </w:rPr>
+              <w:t>Business accounts and plan assignment</w:t>
+            </w:r>
+          </w:p>
+        </w:tc>
+        <w:tc>
+          <w:tcPr>
+            <w:tcW w:type="dxa" w:w="2880"/>
+          </w:tcPr>
+          <w:p>
+            <w:pPr>
+              <w:spacing w:after="100" w:before="100"/>
+            </w:pPr>
+            <w:r>
+              <w:rPr>
+                <w:b w:val="0"/>
+                <w:color w:val="000000"/>
+                <w:sz w:val="18"/>
+              </w:rPr>
+              <w:t>Existing Manage Users and update_plan flow</w:t>
+            </w:r>
+          </w:p>
+        </w:tc>
+        <w:tc>
+          <w:tcPr>
+            <w:tcW w:type="dxa" w:w="4320"/>
+          </w:tcPr>
+          <w:p>
+            <w:pPr>
+              <w:spacing w:after="100" w:before="100"/>
+            </w:pPr>
+            <w:r>
+              <w:rPr>
+                <w:b w:val="0"/>
+                <w:color w:val="000000"/>
+                <w:sz w:val="18"/>
+              </w:rPr>
+              <w:t>Business category, canonical ownership, role accounts and explicit assigned limits</w:t>
+            </w:r>
+          </w:p>
+        </w:tc>
+      </w:tr>
+      <w:tr>
+        <w:tc>
+          <w:tcPr>
+            <w:tcW w:type="dxa" w:w="1872"/>
+          </w:tcPr>
+          <w:p>
+            <w:pPr>
+              <w:spacing w:after="100" w:before="100"/>
+            </w:pPr>
+            <w:r>
+              <w:rPr>
+                <w:b w:val="0"/>
+                <w:color w:val="000000"/>
+                <w:sz w:val="18"/>
+              </w:rPr>
+              <w:t>Messaging and marketing</w:t>
+            </w:r>
+          </w:p>
+        </w:tc>
+        <w:tc>
+          <w:tcPr>
+            <w:tcW w:type="dxa" w:w="2880"/>
+          </w:tcPr>
+          <w:p>
+            <w:pPr>
+              <w:spacing w:after="100" w:before="100"/>
+            </w:pPr>
+            <w:r>
+              <w:rPr>
+                <w:b w:val="0"/>
+                <w:color w:val="000000"/>
+                <w:sz w:val="18"/>
+              </w:rPr>
+              <w:t>Existing inbox, QR, Meta, flows, chatbot, templates and campaigns</w:t>
+            </w:r>
+          </w:p>
+        </w:tc>
+        <w:tc>
+          <w:tcPr>
+            <w:tcW w:type="dxa" w:w="4320"/>
+          </w:tcPr>
+          <w:p>
+            <w:pPr>
+              <w:spacing w:after="100" w:before="100"/>
+            </w:pPr>
+            <w:r>
+              <w:rPr>
+                <w:b w:val="0"/>
+                <w:color w:val="000000"/>
+                <w:sz w:val="18"/>
+              </w:rPr>
+              <w:t>Scoped permissions, category/plan access and verified provider compatibility</w:t>
+            </w:r>
+          </w:p>
+        </w:tc>
+      </w:tr>
+      <w:tr>
+        <w:tc>
+          <w:tcPr>
+            <w:tcW w:type="dxa" w:w="1872"/>
+          </w:tcPr>
+          <w:p>
+            <w:pPr>
+              <w:spacing w:after="100" w:before="100"/>
+            </w:pPr>
+            <w:r>
+              <w:rPr>
+                <w:b w:val="0"/>
+                <w:color w:val="000000"/>
+                <w:sz w:val="18"/>
+              </w:rPr>
+              <w:t>Leads and sales</w:t>
+            </w:r>
+          </w:p>
+        </w:tc>
+        <w:tc>
+          <w:tcPr>
+            <w:tcW w:type="dxa" w:w="2880"/>
+          </w:tcPr>
+          <w:p>
+            <w:pPr>
+              <w:spacing w:after="100" w:before="100"/>
+            </w:pPr>
+            <w:r>
+              <w:rPr>
+                <w:b w:val="0"/>
+                <w:color w:val="000000"/>
+                <w:sz w:val="18"/>
+              </w:rPr>
+              <w:t>Existing Lead Pipeline, Phonebook, Agent Login and Agent Task</w:t>
+            </w:r>
+          </w:p>
+        </w:tc>
+        <w:tc>
+          <w:tcPr>
+            <w:tcW w:type="dxa" w:w="4320"/>
+          </w:tcPr>
+          <w:p>
+            <w:pPr>
+              <w:spacing w:after="100" w:before="100"/>
+            </w:pPr>
+            <w:r>
+              <w:rPr>
+                <w:b w:val="0"/>
+                <w:color w:val="000000"/>
+                <w:sz w:val="18"/>
+              </w:rPr>
+              <w:t>Required lead fields, course interest, outcomes, notes, follow-up and controlled sale conversion</w:t>
+            </w:r>
+          </w:p>
+        </w:tc>
+      </w:tr>
+      <w:tr>
+        <w:tc>
+          <w:tcPr>
+            <w:tcW w:type="dxa" w:w="1872"/>
+          </w:tcPr>
+          <w:p>
+            <w:pPr>
+              <w:spacing w:after="100" w:before="100"/>
+            </w:pPr>
+            <w:r>
+              <w:rPr>
+                <w:b w:val="0"/>
+                <w:color w:val="000000"/>
+                <w:sz w:val="18"/>
+              </w:rPr>
+              <w:t>Course catalogue</w:t>
+            </w:r>
+          </w:p>
+        </w:tc>
+        <w:tc>
+          <w:tcPr>
+            <w:tcW w:type="dxa" w:w="2880"/>
+          </w:tcPr>
+          <w:p>
+            <w:pPr>
+              <w:spacing w:after="100" w:before="100"/>
+            </w:pPr>
+            <w:r>
+              <w:rPr>
+                <w:b w:val="0"/>
+                <w:color w:val="000000"/>
+                <w:sz w:val="18"/>
+              </w:rPr>
+              <w:t>Add a Courses section to the existing /user panel</w:t>
+            </w:r>
+          </w:p>
+        </w:tc>
+        <w:tc>
+          <w:tcPr>
+            <w:tcW w:type="dxa" w:w="4320"/>
+          </w:tcPr>
+          <w:p>
+            <w:pPr>
+              <w:spacing w:after="100" w:before="100"/>
+            </w:pPr>
+            <w:r>
+              <w:rPr>
+                <w:b w:val="0"/>
+                <w:color w:val="000000"/>
+                <w:sz w:val="18"/>
+              </w:rPr>
+              <w:t>Course details, prices, offers, duration and enrollment links</w:t>
+            </w:r>
+          </w:p>
+        </w:tc>
+      </w:tr>
+      <w:tr>
+        <w:tc>
+          <w:tcPr>
+            <w:tcW w:type="dxa" w:w="1872"/>
+          </w:tcPr>
+          <w:p>
+            <w:pPr>
+              <w:spacing w:after="100" w:before="100"/>
+            </w:pPr>
+            <w:r>
+              <w:rPr>
+                <w:b w:val="0"/>
+                <w:color w:val="000000"/>
+                <w:sz w:val="18"/>
+              </w:rPr>
+              <w:t>Finance</w:t>
+            </w:r>
+          </w:p>
+        </w:tc>
+        <w:tc>
+          <w:tcPr>
+            <w:tcW w:type="dxa" w:w="2880"/>
+          </w:tcPr>
+          <w:p>
+            <w:pPr>
+              <w:spacing w:after="100" w:before="100"/>
+            </w:pPr>
+            <w:r>
+              <w:rPr>
+                <w:b w:val="0"/>
+                <w:color w:val="000000"/>
+                <w:sz w:val="18"/>
+              </w:rPr>
+              <w:t>Add a Finance section to the existing /user panel</w:t>
+            </w:r>
+          </w:p>
+        </w:tc>
+        <w:tc>
+          <w:tcPr>
+            <w:tcW w:type="dxa" w:w="4320"/>
+          </w:tcPr>
+          <w:p>
+            <w:pPr>
+              <w:spacing w:after="100" w:before="100"/>
+            </w:pPr>
+            <w:r>
+              <w:rPr>
+                <w:b w:val="0"/>
+                <w:color w:val="000000"/>
+                <w:sz w:val="18"/>
+              </w:rPr>
+              <w:t>Invoice, receivable, installment, payment verification, receipt and correction workflows</w:t>
+            </w:r>
+          </w:p>
+        </w:tc>
+      </w:tr>
+      <w:tr>
+        <w:tc>
+          <w:tcPr>
+            <w:tcW w:type="dxa" w:w="1872"/>
+          </w:tcPr>
+          <w:p>
+            <w:pPr>
+              <w:spacing w:after="100" w:before="100"/>
+            </w:pPr>
+            <w:r>
+              <w:rPr>
+                <w:b w:val="0"/>
+                <w:color w:val="000000"/>
+                <w:sz w:val="18"/>
+              </w:rPr>
+              <w:t>Reports</w:t>
+            </w:r>
+          </w:p>
+        </w:tc>
+        <w:tc>
+          <w:tcPr>
+            <w:tcW w:type="dxa" w:w="2880"/>
+          </w:tcPr>
+          <w:p>
+            <w:pPr>
+              <w:spacing w:after="100" w:before="100"/>
+            </w:pPr>
+            <w:r>
+              <w:rPr>
+                <w:b w:val="0"/>
+                <w:color w:val="000000"/>
+                <w:sz w:val="18"/>
+              </w:rPr>
+              <w:t>Add Reports to the existing /user panel and dashboards</w:t>
+            </w:r>
+          </w:p>
+        </w:tc>
+        <w:tc>
+          <w:tcPr>
+            <w:tcW w:type="dxa" w:w="4320"/>
+          </w:tcPr>
+          <w:p>
+            <w:pPr>
+              <w:spacing w:after="100" w:before="100"/>
+            </w:pPr>
+            <w:r>
+              <w:rPr>
+                <w:b w:val="0"/>
+                <w:color w:val="000000"/>
+                <w:sz w:val="18"/>
+              </w:rPr>
+              <w:t>Agent accountability, daily/weekly/monthly reports, schedules and delivery evidence</w:t>
+            </w:r>
+          </w:p>
+        </w:tc>
+      </w:tr>
+      <w:tr>
+        <w:tc>
+          <w:tcPr>
+            <w:tcW w:type="dxa" w:w="1872"/>
+          </w:tcPr>
+          <w:p>
+            <w:pPr>
+              <w:spacing w:after="100" w:before="100"/>
+            </w:pPr>
+            <w:r>
+              <w:rPr>
+                <w:b w:val="0"/>
+                <w:color w:val="000000"/>
+                <w:sz w:val="18"/>
+              </w:rPr>
+              <w:t>Lead forms</w:t>
+            </w:r>
+          </w:p>
+        </w:tc>
+        <w:tc>
+          <w:tcPr>
+            <w:tcW w:type="dxa" w:w="2880"/>
+          </w:tcPr>
+          <w:p>
+            <w:pPr>
+              <w:spacing w:after="100" w:before="100"/>
+            </w:pPr>
+            <w:r>
+              <w:rPr>
+                <w:b w:val="0"/>
+                <w:color w:val="000000"/>
+                <w:sz w:val="18"/>
+              </w:rPr>
+              <w:t>Extend existing contact/public-form integration where suitable</w:t>
+            </w:r>
+          </w:p>
+        </w:tc>
+        <w:tc>
+          <w:tcPr>
+            <w:tcW w:type="dxa" w:w="4320"/>
+          </w:tcPr>
+          <w:p>
+            <w:pPr>
+              <w:spacing w:after="100" w:before="100"/>
+            </w:pPr>
+            <w:r>
+              <w:rPr>
+                <w:b w:val="0"/>
+                <w:color w:val="000000"/>
+                <w:sz w:val="18"/>
+              </w:rPr>
+              <w:t>Configurable tenant-bound mobile/tablet forms linked to the existing pipeline</w:t>
+            </w:r>
+          </w:p>
+        </w:tc>
+      </w:tr>
+      <w:tr>
+        <w:tc>
+          <w:tcPr>
+            <w:tcW w:type="dxa" w:w="1872"/>
+          </w:tcPr>
+          <w:p>
+            <w:pPr>
+              <w:spacing w:after="100" w:before="100"/>
+            </w:pPr>
+            <w:r>
+              <w:rPr>
+                <w:b w:val="0"/>
+                <w:color w:val="000000"/>
+                <w:sz w:val="18"/>
+              </w:rPr>
+              <w:t>Later business categories</w:t>
+            </w:r>
+          </w:p>
+        </w:tc>
+        <w:tc>
+          <w:tcPr>
+            <w:tcW w:type="dxa" w:w="2880"/>
+          </w:tcPr>
+          <w:p>
+            <w:pPr>
+              <w:spacing w:after="100" w:before="100"/>
+            </w:pPr>
+            <w:r>
+              <w:rPr>
+                <w:b w:val="0"/>
+                <w:color w:val="000000"/>
+                <w:sz w:val="18"/>
+              </w:rPr>
+              <w:t>Existing category/feature layer and same panels</w:t>
+            </w:r>
+          </w:p>
+        </w:tc>
+        <w:tc>
+          <w:tcPr>
+            <w:tcW w:type="dxa" w:w="4320"/>
+          </w:tcPr>
+          <w:p>
+            <w:pPr>
+              <w:spacing w:after="100" w:before="100"/>
+            </w:pPr>
+            <w:r>
+              <w:rPr>
+                <w:b w:val="0"/>
+                <w:color w:val="000000"/>
+                <w:sz w:val="18"/>
+              </w:rPr>
+              <w:t>Category-specific menus and workflows without another SaaS project</w:t>
+            </w:r>
+          </w:p>
+        </w:tc>
+      </w:tr>
+    </w:tbl>
+    <w:p>
+      <w:pPr/>
+      <w:r>
+        <w:t>Use the isolated databases and API tests to verify behavior. Earlier standalone workspace/login/plan screens are test artifacts only and are not the final product or acceptance evidence for integration. Reuse their validated backend services where useful; refactor useful UI controls into the existing module rather than deploying those separate shells.</w:t>
+      </w:r>
+    </w:p>
+    <w:p>
+      <w:pPr/>
+      <w:r>
+        <w:t>Missing original frontend source does not authorize rebuilding the whole UI. Recover relevant inputs where available, or extend the existing source-controlled screen hooks and modules without replacing the current shell or manually patching minified application logic. Record module-specific source limitations and continue useful backend and existing-module work. A ticket is complete only when its added behavior works through the corresponding existing screen with old functionality preserved.</w:t>
+      </w:r>
+    </w:p>
+    <w:p>
+      <w:pPr>
+        <w:pStyle w:val="Heading2"/>
+      </w:pPr>
+      <w:r>
+        <w:t>Delivery areas</w:t>
       </w:r>
     </w:p>
     <w:tbl>
@@ -1485,10 +2143,7 @@
               <w:spacing w:after="60" w:before="40" w:line="245" w:lineRule="auto"/>
             </w:pPr>
             <w:r>
-              <w:rPr>
-                <w:sz w:val="19"/>
-              </w:rPr>
-              <w:t>Built JavaScript/CSS shell plus a separately editable pipeline UI; no JSX/TSX/source maps found in inspected client tree</w:t>
+              <w:t>Built JavaScript/CSS shell plus editable admin-actions and pipeline integration scripts; no JSX/TSX/source maps found in inspected client tree</w:t>
             </w:r>
           </w:p>
         </w:tc>
@@ -1508,10 +2163,7 @@
               <w:spacing w:after="60" w:before="40" w:line="245" w:lineRule="auto"/>
             </w:pPr>
             <w:r>
-              <w:rPr>
-                <w:sz w:val="19"/>
-              </w:rPr>
-              <w:t>Recover the editable frontend source/build pipeline before broad UI work; do not rely on patching minified bundles</w:t>
+              <w:t>Preserve the existing shell and extend source-controlled modules/hooks; recover relevant frontend inputs where available, without rebuilding the application or patching minified logic</w:t>
             </w:r>
           </w:p>
         </w:tc>
@@ -1695,7 +2347,7 @@
     </w:p>
     <w:p>
       <w:r>
-        <w:t>Do not substitute another SaleMaX/GCCBOT checkout for this product. Do not read or copy credentials or personal backup data into the plan. Preserve the existing source as a baseline and treat the frontend-source recovery as an explicit P0 dependency. If the original editable shell cannot be recovered, approve a maintained recreation of that same shell and route behavior; retain the backend and existing product workflows and revise the estimate before starting that work.</w:t>
+        <w:t>Do not substitute another SaleMaX/GCCBOT checkout for this product. Do not read or copy credentials or personal backup data into the plan. Preserve the existing project and its panels. Recover relevant frontend source where available; otherwise extend the existing maintained modules/hooks and document the affected component limitation. Recreating the shell or starting another frontend project is outside this upgrade's scope. Continue backend and existing-module work that does not depend on missing inputs.</w:t>
       </w:r>
     </w:p>
     <w:p>
@@ -2694,17 +3346,7 @@
     </w:p>
     <w:p>
       <w:r>
-        <w:t xml:space="preserve">Route family </w:t>
-      </w:r>
-      <w:r>
-        <w:rPr>
-          <w:rFonts w:ascii="Consolas" w:hAnsi="Consolas"/>
-          <w:sz w:val="18"/>
-        </w:rPr>
-        <w:t>/super-admin</w:t>
-      </w:r>
-      <w:r>
-        <w:t>. Only the owner identity has this role; no public registration, tenant invitation, staff promotion or ordinary profile editor can grant it. Require MFA, sensitive-action reauthentication, recovery codes, session revocation and owner-role transfer through a dedicated audited recovery procedure.</w:t>
+        <w:t>Use the existing /admin panel and /admin/login entry point, with owner-only Super Admin permissions and owner-specific screens inside that panel. Only the owner identity has this role; no public registration, tenant invitation, staff promotion or ordinary profile editor can grant it. Require MFA, sensitive-action reauthentication, recovery codes, session revocation and owner-role transfer through a dedicated audited recovery procedure.</w:t>
       </w:r>
     </w:p>
     <w:p>
@@ -2732,17 +3374,7 @@
     </w:p>
     <w:p>
       <w:r>
-        <w:t xml:space="preserve">Route family </w:t>
-      </w:r>
-      <w:r>
-        <w:rPr>
-          <w:rFonts w:ascii="Consolas" w:hAnsi="Consolas"/>
-          <w:sz w:val="18"/>
-        </w:rPr>
-        <w:t>/staff-admin</w:t>
-      </w:r>
-      <w:r>
-        <w:t>. Staff manage tenant onboarding, users, account recovery assistance, draft plans, approved plan assignments, seats within delegation, account status and support tickets. The owner grants granular permissions rather than a single unrestricted staff role.</w:t>
+        <w:t>Use the existing /admin panel and administration login with a delegated staff role and a permission-scoped menu. Staff manage tenant onboarding through Manage Users, plans through Manage Plans, account recovery assistance, approved plan assignments, seats within delegation, account status and support tickets. The owner grants granular permissions rather than a single unrestricted staff role. Staff cannot access owner-only Super Admin operations.</w:t>
       </w:r>
     </w:p>
     <w:p>
@@ -5201,7 +5833,7 @@
     </w:p>
     <w:p>
       <w:r>
-        <w:t>Use one familiar shell with tenant branding, role badge, language toggle, notification center and global search restricted to accessible records. New features use proper routes and detail screens. Group the sidebar for readability while keeping the requested labels recognizable.</w:t>
+        <w:t>Extend the existing admin and user shells with tenant branding, role badge, language toggle, notification center and global search restricted to accessible records. Upgrade existing screen components and actions first. Missing features use proper routes and detail screens within those panels, preserving the current query-page navigation where applicable. Group the sidebar for readability while keeping existing entries and requested labels recognizable. New styling must fit the current UI; do not deploy the separate test workspace as its replacement.</w:t>
       </w:r>
     </w:p>
     <w:tbl>
@@ -10204,7 +10836,7 @@
     </w:p>
     <w:p>
       <w:r>
-        <w:t>Version 1.1 adds seven foundation/operational tickets. Treat the earlier window as provisional: TC00 and TC35 must re-estimate it against frontend recovery, legacy route coverage and the additional contracts before committing a delivery date. An unrecoverable frontend is a material schedule change, not a small rebranding task.</w:t>
+        <w:t>Version 1.1 added seven foundation/operational tickets; version 1.2 confirms the existing-project integration requirement. Treat the earlier window as provisional: TC00 and TC35 must re-estimate the required module extensions, legacy route coverage and additional contracts before committing a delivery date. Prioritize reuse and avoid spending the schedule rebuilding panels or features already present. Record any source limitation against the affected module, not as permission for a replacement project.</w:t>
       </w:r>
     </w:p>
     <w:tbl>
@@ -10396,10 +11028,7 @@
               <w:spacing w:after="60" w:before="40" w:line="245" w:lineRule="auto"/>
             </w:pPr>
             <w:r>
-              <w:rPr>
-                <w:sz w:val="19"/>
-              </w:rPr>
-              <w:t>Verify source, recover editable frontend, repair migration process and establish baseline; design approval</w:t>
+              <w:t>Verify existing source/modules, recover relevant inputs where available, repair migrations and establish baseline</w:t>
             </w:r>
           </w:p>
         </w:tc>
@@ -10419,10 +11048,7 @@
               <w:spacing w:after="60" w:before="40" w:line="245" w:lineRule="auto"/>
             </w:pPr>
             <w:r>
-              <w:rPr>
-                <w:sz w:val="19"/>
-              </w:rPr>
-              <w:t>Reproducible baseline and preservation map</w:t>
+              <w:t>Reproducible baseline and existing-module extension map</w:t>
             </w:r>
           </w:p>
         </w:tc>
@@ -11240,10 +11866,7 @@
               <w:spacing w:after="60" w:before="40" w:line="245" w:lineRule="auto"/>
             </w:pPr>
             <w:r>
-              <w:rPr>
-                <w:sz w:val="19"/>
-              </w:rPr>
-              <w:t>Source/runtime audit, editable frontend recovery, safe migration runner and scoped Git baseline; startup is reproducible, real tests exist and preservation status is recorded</w:t>
+              <w:t>Audit the existing source/runtime and module extension points, safe migrations and scoped Git; recover relevant inputs without replacing the shell; startup and preservation evidence recorded</w:t>
             </w:r>
           </w:p>
         </w:tc>
@@ -11337,10 +11960,7 @@
               <w:spacing w:after="60" w:before="40" w:line="245" w:lineRule="auto"/>
             </w:pPr>
             <w:r>
-              <w:rPr>
-                <w:sz w:val="19"/>
-              </w:rPr>
-              <w:t>Owner/staff/tenant prototypes and EN/AR route map; requested features trace to screens and role landing pages</w:t>
+              <w:t>Map requirements to existing admin/user screens and EN/AR navigation; retain panels and add only missing screens; prototypes are optional test aids, never the product destination</w:t>
             </w:r>
           </w:p>
         </w:tc>
@@ -11822,10 +12442,7 @@
               <w:spacing w:after="60" w:before="40" w:line="245" w:lineRule="auto"/>
             </w:pPr>
             <w:r>
-              <w:rPr>
-                <w:sz w:val="19"/>
-              </w:rPr>
-              <w:t>Plan drafts/versions, assignments and impact preview; edits preserve existing plan contracts</w:t>
+              <w:t>Upgrade existing Manage Plans and Manage Users assignment with categories, features, role limits, versions and impact preview; preserve existing IDs, commercial fields and assigned contracts</w:t>
             </w:r>
           </w:p>
         </w:tc>
@@ -15489,7 +16106,7 @@
         <w:ind w:left="230"/>
       </w:pPr>
       <w:r>
-        <w:t>Work on the verified source repository for this specific SaleMaX product. Read repository instructions and this plan first. Start with TC00 and record the actual stack, routes, schema, providers, existing features and reproducible baseline. Extend the existing shell and identity where possible. Implement the earliest unblocked ticket in dependency order. Enforce tenant, category, role and plan constraints in the backend. Keep finance posting transactional and idempotent. Add relevant tests and bilingual UI verification, document evidence and commit only intended files. Do not expose secrets or claim real-provider verification from simulated tests. Continue credential-free work while provider or owner decisions are pending. Record unresolved gates without shrinking the objective. Stop implementation only at a genuine dependency requiring owner input; complete the release only after the full paid-launch gate passes.</w:t>
+        <w:t>Upgrade the verified source repository for this specific existing SaleMaX product. Read repository instructions and this plan first. Reuse the current admin/user panels and working modules; do not create a replacement project, shell, login, CRM or duplicate catalogue. Start plan work in existing Manage Plans and account assignment in existing Manage Users. Add only missing screens inside those panels. Record actual integration points and preserve old routes, IDs, fields, records and working journeys. Implement unblocked tickets in dependency order, using tested backend services behind the corresponding existing screens. Enforce tenant, category, role and plan constraints in the backend. Keep finance posting transactional and idempotent. Verify old and added functionality in English/Arabic, document evidence, and commit intended files. Test-only standalone screens do not count as integrated delivery. Do not expose secrets or claim provider verification from simulated tests. Continue useful work while external gates remain open, preserve the full scope, and release only after the paid-launch gate passes.</w:t>
       </w:r>
     </w:p>
     <w:p>
@@ -17398,7 +18015,7 @@
     </w:p>
     <w:p>
       <w:r>
-        <w:t>TC00 establishes a reproducible backend startup, safe forward-only migration selection, scoped Git history and an editable frontend/build path. Recover the original frontend source and lockfile where possible. If recovery fails, record a maintained recreation of the existing shell, route contracts, feature controls and EN/AR behavior as explicit work; a new frontend must pass the same preservation tests before replacing the compiled shell. It must not create a second CRM, second tenant system or disconnected login. Inspect source/licensing rights before distributing or selling modified software. No license-rights conclusion is implied by a package metadata field.</w:t>
+        <w:t>TC00 establishes reproducible startup, safe migrations, scoped Git history and maintained extension points in the existing application. Recover relevant frontend source and lockfiles where available. If an input is missing, record the affected module limitation and use existing source-controlled integration scripts/components where suitable; do not recreate or replace the application shell. Existing admin/user panels, login routes, APIs and working features remain the integration baseline. No second CRM, tenant system, plan catalogue or disconnected login is allowed. Inspect source/licensing rights before distributing or selling modified software. No license-rights conclusion is implied by package metadata.</w:t>
       </w:r>
     </w:p>
     <w:p>
@@ -17416,7 +18033,7 @@
     </w:p>
     <w:p>
       <w:r>
-        <w:t>Every ticket is Ready only when its dependencies, screen behavior, API request/response/error schemas, storage migration, permissions, empty/error states, side effects, rollback/recovery procedure and acceptance tests are recorded. For finance tickets, include invariant equations and rounding examples. For providers, include adapter capability, verification method, sandbox/live separation and known failure outcomes. A screen prototype alone does not make its backend Ready.</w:t>
+        <w:t>Every ticket is Ready only when its dependencies, exact existing-module integration point, screen behavior, API request/response/error schemas, storage migration, permissions, empty/error states, side effects, recovery procedure and acceptance tests are recorded. Identify whether the work extends an existing screen or adds a missing screen inside an existing panel, and list the old behavior to preserve. For finance, include invariant equations and rounding examples. For providers, include capability, verification method, sandbox/live separation and known failure outcomes. A prototype or isolated API check does not prove delivery through the existing module.</w:t>
       </w:r>
     </w:p>
     <w:p>
@@ -18523,10 +19140,7 @@
               <w:spacing w:after="60" w:before="40" w:line="245" w:lineRule="auto"/>
             </w:pPr>
             <w:r>
-              <w:rPr>
-                <w:sz w:val="19"/>
-              </w:rPr>
-              <w:t>Compiled frontend without editable build inputs</w:t>
+              <w:t>Compiled frontend without all original build inputs</w:t>
             </w:r>
           </w:p>
         </w:tc>
@@ -18546,10 +19160,7 @@
               <w:spacing w:after="60" w:before="40" w:line="245" w:lineRule="auto"/>
             </w:pPr>
             <w:r>
-              <w:rPr>
-                <w:sz w:val="19"/>
-              </w:rPr>
-              <w:t>Blocks broad UI implementation</w:t>
+              <w:t>Limits affected component edits</w:t>
             </w:r>
           </w:p>
         </w:tc>
@@ -18569,10 +19180,7 @@
               <w:spacing w:after="60" w:before="40" w:line="245" w:lineRule="auto"/>
             </w:pPr>
             <w:r>
-              <w:rPr>
-                <w:sz w:val="19"/>
-              </w:rPr>
-              <w:t>Recover or maintainably recreate the same shell; TC00 and TC40</w:t>
+              <w:t>Recover relevant inputs or extend maintained existing modules/hooks; preserve the shell and forbid replacement-project work; TC00 and TC40</w:t>
             </w:r>
           </w:p>
         </w:tc>

</xml_diff>

<commit_message>
Align platform docs with 7Network brand
</commit_message>
<xml_diff>
--- a/docs/SALEMAX_TRAINING_CENTER_IMPLEMENTATION_PLAN.docx
+++ b/docs/SALEMAX_TRAINING_CENTER_IMPLEMENTATION_PLAN.docx
@@ -7,7 +7,7 @@
         <w:pStyle w:val="Title"/>
       </w:pPr>
       <w:r>
-        <w:t>SaleMaX SaaS Upgrade and Training Center Implementation Plan</w:t>
+        <w:t>7Network SaaS Upgrade and Training Center Implementation Plan</w:t>
       </w:r>
     </w:p>
     <w:p>
@@ -25,7 +25,7 @@
     </w:p>
     <w:p>
       <w:r>
-        <w:t>Upgrade the existing SaleMaX application into a category-based business SaaS, launching with a complete training-center sales and collections workspace. Reuse its working modules, admin and user panels, messaging and agent experience. Add the missing requirements to this project and connect every enquiry to an accountable agent, a course, an enrollment, an invoice, an installment schedule, and verified receipts.</w:t>
+        <w:t>Upgrade the existing 7Network application into a category-based business SaaS, launching with a complete training-center sales and collections workspace. Reuse its working modules, admin and user panels, messaging and agent experience. Add the missing requirements to this project and connect every enquiry to an accountable agent, a course, an enrollment, an invoice, an installment schedule, and verified receipts.</w:t>
       </w:r>
     </w:p>
     <w:p>
@@ -60,7 +60,7 @@
     <w:p>
       <w:pPr/>
       <w:r>
-        <w:t>The owner confirmed that this is an upgrade of the supplied SaleMaX project. No new project, replacement application, recreated shell, separate CRM, duplicate plan catalogue, or parallel login is authorized. Preserve the existing backend, admin panel, user panel, working modules, navigation, branding and English/Arabic behavior. Improve existing screens in place; add screens only for requirements the application does not already provide, inside the appropriate existing panel.</w:t>
+        <w:t>The owner confirmed that this is an upgrade of the supplied project, whose current platform brand is 7Network; historical source, repository and schema identifiers may still use SaleMaX spelling.</w:t>
       </w:r>
     </w:p>
     <w:p>
@@ -90,6 +90,7 @@
       <w:tr>
         <w:trPr>
           <w:tblHeader/>
+          <w:cantSplit/>
         </w:trPr>
         <w:tc>
           <w:tcPr>
@@ -150,6 +151,9 @@
         </w:tc>
       </w:tr>
       <w:tr>
+        <w:trPr>
+          <w:cantSplit/>
+        </w:trPr>
         <w:tc>
           <w:tcPr>
             <w:tcW w:type="dxa" w:w="1872"/>
@@ -206,6 +210,9 @@
         </w:tc>
       </w:tr>
       <w:tr>
+        <w:trPr>
+          <w:cantSplit/>
+        </w:trPr>
         <w:tc>
           <w:tcPr>
             <w:tcW w:type="dxa" w:w="1872"/>
@@ -262,6 +269,9 @@
         </w:tc>
       </w:tr>
       <w:tr>
+        <w:trPr>
+          <w:cantSplit/>
+        </w:trPr>
         <w:tc>
           <w:tcPr>
             <w:tcW w:type="dxa" w:w="1872"/>
@@ -318,6 +328,9 @@
         </w:tc>
       </w:tr>
       <w:tr>
+        <w:trPr>
+          <w:cantSplit/>
+        </w:trPr>
         <w:tc>
           <w:tcPr>
             <w:tcW w:type="dxa" w:w="1872"/>
@@ -374,6 +387,9 @@
         </w:tc>
       </w:tr>
       <w:tr>
+        <w:trPr>
+          <w:cantSplit/>
+        </w:trPr>
         <w:tc>
           <w:tcPr>
             <w:tcW w:type="dxa" w:w="1872"/>
@@ -430,6 +446,9 @@
         </w:tc>
       </w:tr>
       <w:tr>
+        <w:trPr>
+          <w:cantSplit/>
+        </w:trPr>
         <w:tc>
           <w:tcPr>
             <w:tcW w:type="dxa" w:w="1872"/>
@@ -486,6 +505,9 @@
         </w:tc>
       </w:tr>
       <w:tr>
+        <w:trPr>
+          <w:cantSplit/>
+        </w:trPr>
         <w:tc>
           <w:tcPr>
             <w:tcW w:type="dxa" w:w="1872"/>
@@ -542,6 +564,9 @@
         </w:tc>
       </w:tr>
       <w:tr>
+        <w:trPr>
+          <w:cantSplit/>
+        </w:trPr>
         <w:tc>
           <w:tcPr>
             <w:tcW w:type="dxa" w:w="1872"/>
@@ -598,6 +623,9 @@
         </w:tc>
       </w:tr>
       <w:tr>
+        <w:trPr>
+          <w:cantSplit/>
+        </w:trPr>
         <w:tc>
           <w:tcPr>
             <w:tcW w:type="dxa" w:w="1872"/>
@@ -654,6 +682,9 @@
         </w:tc>
       </w:tr>
       <w:tr>
+        <w:trPr>
+          <w:cantSplit/>
+        </w:trPr>
         <w:tc>
           <w:tcPr>
             <w:tcW w:type="dxa" w:w="1872"/>
@@ -845,7 +876,7 @@
               <w:rPr>
                 <w:sz w:val="19"/>
               </w:rPr>
-              <w:t>Owner-only Super Admin, delegated SaleMaX Staff Admin, tenant accounts, plans, limits, audit, health monitoring</w:t>
+              <w:t>Owner-only Super Admin, delegated 7Network Staff Admin, tenant accounts, plans, limits, audit, health monitoring</w:t>
             </w:r>
           </w:p>
         </w:tc>
@@ -1426,7 +1457,7 @@
               <w:rPr>
                 <w:sz w:val="19"/>
               </w:rPr>
-              <w:t>SaleMaX Node 3.6 package; Express backend, Socket.IO, mysql2, Baileys and Nodemailer dependencies</w:t>
+              <w:t>Historical SaleMaX Node 3.6 package, now branded 7Network; Express backend, Socket.IO, mysql2, Baileys and Nodemailer dependencies</w:t>
             </w:r>
           </w:p>
         </w:tc>
@@ -2347,7 +2378,7 @@
     </w:p>
     <w:p>
       <w:r>
-        <w:t>Do not substitute another SaleMaX/GCCBOT checkout for this product. Do not read or copy credentials or personal backup data into the plan. Preserve the existing project and its panels. Recover relevant frontend source where available; otherwise extend the existing maintained modules/hooks and document the affected component limitation. Recreating the shell or starting another frontend project is outside this upgrade's scope. Continue backend and existing-module work that does not depend on missing inputs.</w:t>
+        <w:t>Do not substitute another 7Network/GCCBOT checkout for this product. Do not read or copy credentials or personal backup data into the plan. Preserve the existing project and its panels. Recover relevant frontend source where available; otherwise extend the existing maintained modules/hooks and document the affected component limitation. Recreating the shell or starting another frontend project is outside this upgrade's scope. Continue backend and existing-module work that does not depend on missing inputs.</w:t>
       </w:r>
     </w:p>
     <w:p>
@@ -2745,7 +2776,7 @@
               <w:rPr>
                 <w:sz w:val="19"/>
               </w:rPr>
-              <w:t>SaleMaX staff assign an approved higher/lower limit</w:t>
+              <w:t>7Network staff assign an approved higher/lower limit</w:t>
             </w:r>
           </w:p>
         </w:tc>
@@ -3018,7 +3049,7 @@
               <w:rPr>
                 <w:sz w:val="19"/>
               </w:rPr>
-              <w:t>SaleMaX platform with tenant-branded forms and documents</w:t>
+              <w:t>7Network platform with tenant-branded forms and documents</w:t>
             </w:r>
           </w:p>
         </w:tc>
@@ -3073,12 +3104,12 @@
         <w:t>Summary:</w:t>
       </w:r>
       <w:r>
-        <w:t xml:space="preserve"> Combine the training-provider registration model with SaleMaX messaging, then differentiate through agent accountability and collections visibility.</w:t>
+        <w:t xml:space="preserve"> Combine the training-provider registration model with 7Network messaging, then differentiate through agent accountability and collections visibility.</w:t>
       </w:r>
     </w:p>
     <w:p>
       <w:r>
-        <w:t xml:space="preserve">Arlo's registration offering links forms, course registrations, invoicing and learner records, and supports course transfers and cancellations. This supports treating enrollment as its own record rather than making a pipeline column the only proof of a course sale. SaleMaX should connect its existing lead experience to that record and retain the sales history. </w:t>
+        <w:t xml:space="preserve">Arlo's registration offering links forms, course registrations, invoicing and learner records, and supports course transfers and cancellations. This supports treating enrollment as its own record rather than making a pipeline column the only proof of a course sale. 7Network should connect its existing lead experience to that record and retain the sales history. </w:t>
       </w:r>
       <w:hyperlink r:id="rId9">
         <w:r>
@@ -3369,7 +3400,7 @@
         <w:pStyle w:val="Heading2"/>
       </w:pPr>
       <w:r>
-        <w:t>SaleMaX Staff Admin</w:t>
+        <w:t>7Network Staff Admin</w:t>
       </w:r>
     </w:p>
     <w:p>
@@ -8034,7 +8065,7 @@
     </w:p>
     <w:p>
       <w:r>
-        <w:t>Online: the customer uses hosted provider checkout owned by the training center's merchant account. Verified signed callbacks and server-side provider retrieval confirm amount, currency, merchant and invoice. A return URL alone never marks paid. Deduplicate both provider event IDs and underlying transaction IDs; reconcile unresolved and out-of-order events. Card data never enters SaleMaX form fields.</w:t>
+        <w:t>Online: the customer uses hosted provider checkout owned by the training center's merchant account. Verified signed callbacks and server-side provider retrieval confirm amount, currency, merchant and invoice. A return URL alone never marks paid. Deduplicate both provider event IDs and underlying transaction IDs; reconcile unresolved and out-of-order events. Card data never enters 7Network form fields.</w:t>
       </w:r>
     </w:p>
     <w:p>
@@ -15884,7 +15915,7 @@
     </w:p>
     <w:p>
       <w:r>
-        <w:t>Map existing main accounts to tenants and tenant owners. Map agents to memberships with stable historical actor references. Existing administrator maps to Super Admin only after owner identity confirmation; newly created SaleMaX staff get explicit staff roles. Never mass-upgrade historical admin-like accounts to platform owner.</w:t>
+        <w:t>Map existing main accounts to tenants and tenant owners. Map agents to memberships with stable historical actor references. Existing administrator maps to Super Admin only after owner identity confirmation; newly created 7Network staff get explicit staff roles. Never mass-upgrade historical admin-like accounts to platform owner.</w:t>
       </w:r>
     </w:p>
     <w:p>
@@ -16106,7 +16137,7 @@
         <w:ind w:left="230"/>
       </w:pPr>
       <w:r>
-        <w:t>Upgrade the verified source repository for this specific existing SaleMaX product. Read repository instructions and this plan first. Reuse the current admin/user panels and working modules; do not create a replacement project, shell, login, CRM or duplicate catalogue. Start plan work in existing Manage Plans and account assignment in existing Manage Users. Add only missing screens inside those panels. Record actual integration points and preserve old routes, IDs, fields, records and working journeys. Implement unblocked tickets in dependency order, using tested backend services behind the corresponding existing screens. Enforce tenant, category, role and plan constraints in the backend. Keep finance posting transactional and idempotent. Verify old and added functionality in English/Arabic, document evidence, and commit intended files. Test-only standalone screens do not count as integrated delivery. Do not expose secrets or claim provider verification from simulated tests. Continue useful work while external gates remain open, preserve the full scope, and release only after the paid-launch gate passes.</w:t>
+        <w:t>Upgrade the verified source repository for this specific existing 7Network product. Read repository instructions and this plan first. Reuse the current admin/user panels and working modules; do not create a replacement project, shell, login, CRM or duplicate catalogue. Start plan work in existing Manage Plans and account assignment in existing Manage Users. Add only missing screens inside those panels. Record actual integration points and preserve old routes, IDs, fields, records and working journeys. Implement unblocked tickets in dependency order, using tested backend services behind the corresponding existing screens. Enforce tenant, category, role and plan constraints in the backend. Keep finance posting transactional and idempotent. Verify old and added functionality in English/Arabic, document evidence, and commit intended files. Test-only standalone screens do not count as integrated delivery. Do not expose secrets or claim provider verification from simulated tests. Continue useful work while external gates remain open, preserve the full scope, and release only after the paid-launch gate passes.</w:t>
       </w:r>
     </w:p>
     <w:p>
@@ -19002,7 +19033,7 @@
     </w:p>
     <w:p>
       <w:r>
-        <w:t>Record accepted throughput per workload and resource use, not just a total user count. Define overload behavior: bounded payloads/queues, rate-limit responses, retry-after, delayed exports and visible delivery status. Reports/receipts get protected capacity ahead of bulk campaigns. Prove shared-host separation or move SaleMaX to its own approved infrastructure before advertising scale that exceeds the measured budget.</w:t>
+        <w:t>Record accepted throughput per workload and resource use, not just a total user count. Define overload behavior: bounded payloads/queues, rate-limit responses, retry-after, delayed exports and visible delivery status. Reports/receipts get protected capacity ahead of bulk campaigns. Prove shared-host separation or move 7Network to its own approved infrastructure before advertising scale that exceeds the measured budget.</w:t>
       </w:r>
     </w:p>
     <w:p>
@@ -19943,6 +19974,7 @@
     </w:p>
     <w:sectPr>
       <w:footerReference w:type="default" r:id="rId21"/>
+      <w:headerReference w:type="default" r:id="rId22"/>
       <w:pgSz w:w="11909" w:h="16834"/>
       <w:pgMar w:top="1037" w:right="1008" w:bottom="936" w:left="1008" w:header="720" w:footer="720" w:gutter="0"/>
       <w:cols w:space="720"/>
@@ -19964,11 +19996,21 @@
       <w:rPr>
         <w:sz w:val="16"/>
       </w:rPr>
-      <w:t xml:space="preserve">SaleMaX  |  Implementation plan  |  </w:t>
+      <w:t xml:space="preserve">7Network  |  Implementation plan  |  </w:t>
     </w:r>
     <w:fldSimple w:instr="PAGE"/>
   </w:p>
 </w:ftr>
+</file>
+
+<file path=word/header1.xml><?xml version="1.0" encoding="utf-8"?>
+<w:hdr xmlns:m="http://schemas.openxmlformats.org/officeDocument/2006/math" xmlns:mc="http://schemas.openxmlformats.org/markup-compatibility/2006" xmlns:mo="http://schemas.microsoft.com/office/mac/office/2008/main" xmlns:mv="urn:schemas-microsoft-com:mac:vml" xmlns:o="urn:schemas-microsoft-com:office:office" xmlns:r="http://schemas.openxmlformats.org/officeDocument/2006/relationships" xmlns:v="urn:schemas-microsoft-com:vml" xmlns:w10="urn:schemas-microsoft-com:office:word" xmlns:w14="http://schemas.microsoft.com/office/word/2010/wordml" xmlns:w="http://schemas.openxmlformats.org/wordprocessingml/2006/main" xmlns:wne="http://schemas.microsoft.com/office/word/2006/wordml" xmlns:wp14="http://schemas.microsoft.com/office/word/2010/wordprocessingDrawing" xmlns:wp="http://schemas.openxmlformats.org/drawingml/2006/wordprocessingDrawing" xmlns:wpc="http://schemas.microsoft.com/office/word/2010/wordprocessingCanvas" xmlns:wpg="http://schemas.microsoft.com/office/word/2010/wordprocessingGroup" xmlns:wpi="http://schemas.microsoft.com/office/word/2010/wordprocessingInk" xmlns:wps="http://schemas.microsoft.com/office/word/2010/wordprocessingShape" mc:Ignorable="w14 wp14">
+  <w:p>
+    <w:pPr>
+      <w:pStyle w:val="Header"/>
+    </w:pPr>
+  </w:p>
+</w:hdr>
 </file>
 
 <file path=word/numbering.xml><?xml version="1.0" encoding="utf-8"?>

</xml_diff>